<commit_message>
Verified question bank: clinical-accuracy and adversarial review edits for all eight categories; refresh study pack
Co-Authored-By: Claude Fable 5.1 <noreply@anthropic.com>
Claude-Session: https://claude.ai/code/session_01QeqMPafx2Y49qSQseFxfzV
</commit_message>
<xml_diff>
--- a/nclex-voice-quiz/study-pack/From Claude - NCLEX study pack/NCLEX question bank - readable (from Claude).docx
+++ b/nclex-voice-quiz/study-pack/From Claude - NCLEX study pack/NCLEX question bank - readable (from Claude).docx
@@ -362,7 +362,7 @@
         <w:t xml:space="preserve">A — incorrect: </w:t>
       </w:r>
       <w:r>
-        <w:t xml:space="preserve">A one kilogram overnight gain with edema signals fluid retention that needs attention and a provider update, but it is a gradual change rather than an acute threat to oxygenation, so it can safely wait a few minutes.</w:t>
+        <w:t xml:space="preserve">A one kilogram overnight gain with edema is a reportable sign of fluid retention that needs a provider update this shift, but the client is not showing any change in breathing or level of consciousness, so it ranks below an acute threat to oxygenation.</w:t>
       </w:r>
     </w:p>
     <w:p>
@@ -1812,7 +1812,7 @@
           <w:sz w:val="18"/>
           <w:szCs w:val="18"/>
         </w:rPr>
-        <w:t xml:space="preserve">moc-009 · Difficulty: hard · Clinical judgment: Evaluate Outcomes · quality improvement, falls, outcome measures</w:t>
+        <w:t xml:space="preserve">moc-009 · Difficulty: hard · Clinical judgment: Evaluate Outcomes · quality improvement, falls, outcome measures, rates</w:t>
       </w:r>
     </w:p>
     <w:p>
@@ -1881,7 +1881,7 @@
         <w:t xml:space="preserve">C.  </w:t>
       </w:r>
       <w:r>
-        <w:t xml:space="preserve">Client satisfaction scores for nurse responsiveness increased by twelve points over the period.</w:t>
+        <w:t xml:space="preserve">The total number of falls decreased from 14 to 9, during a period when the unit's average census was lower than before the project.</w:t>
       </w:r>
     </w:p>
     <w:p>
@@ -1934,7 +1934,7 @@
         <w:t xml:space="preserve">B — correct: </w:t>
       </w:r>
       <w:r>
-        <w:t xml:space="preserve">The fall rate is the outcome measure tied directly to the project's goal, and a rate expressed per one thousand client days adjusts for census so the before and after periods can be compared fairly.</w:t>
+        <w:t xml:space="preserve">The fall rate is the outcome measure tied directly to the project's goal, and expressing it per one thousand client days adjusts for changes in census so the before and after periods can be compared fairly.</w:t>
       </w:r>
     </w:p>
     <w:p>
@@ -1954,7 +1954,7 @@
         <w:t xml:space="preserve">C — incorrect: </w:t>
       </w:r>
       <w:r>
-        <w:t xml:space="preserve">Improved satisfaction is a welcome secondary effect of rounding, but it measures the client's experience rather than fall occurrence, so it cannot prove the fall-reduction goal was met.</w:t>
+        <w:t xml:space="preserve">A raw count of falls has no denominator, so when fewer clients were on the unit the drop may simply reflect fewer opportunities to fall rather than safer care; only a rate per one thousand client days lets the two periods be compared fairly.</w:t>
       </w:r>
     </w:p>
     <w:p>
@@ -1969,7 +1969,7 @@
         <w:t xml:space="preserve">Teaching point: </w:t>
       </w:r>
       <w:r>
-        <w:t xml:space="preserve">To judge whether a quality improvement project worked, look at the outcome measure that matches its stated goal; process measures show only that the change was implemented.</w:t>
+        <w:t xml:space="preserve">To judge whether a quality improvement project worked, look at the census-adjusted outcome measure that matches its stated goal; process measures show only that the change was implemented, and raw counts can mislead when the census changes.</w:t>
       </w:r>
     </w:p>
     <w:p>
@@ -2006,7 +2006,7 @@
           <w:sz w:val="18"/>
           <w:szCs w:val="18"/>
         </w:rPr>
-        <w:t xml:space="preserve">moc-010 · Difficulty: hard · Clinical judgment: Take Action · assignment, lpn scope, transfusion, charge nurse</w:t>
+        <w:t xml:space="preserve">moc-010 · Difficulty: hard · Clinical judgment: Take Action · assignment, lpn scope, postoperative, charge nurse</w:t>
       </w:r>
     </w:p>
     <w:p>
@@ -2056,7 +2056,7 @@
         <w:t xml:space="preserve">B.  </w:t>
       </w:r>
       <w:r>
-        <w:t xml:space="preserve">A client who began receiving a unit of packed red blood cells ten minutes ago.</w:t>
+        <w:t xml:space="preserve">A client who arrived on the unit twenty minutes ago from the post-anesthesia care unit after an open appendectomy.</w:t>
       </w:r>
     </w:p>
     <w:p>
@@ -2128,7 +2128,7 @@
         <w:t xml:space="preserve">B — incorrect: </w:t>
       </w:r>
       <w:r>
-        <w:t xml:space="preserve">The first fifteen minutes of a transfusion carry the highest risk of an acute reaction, and blood administration and reaction assessment are generally a registered nurse responsibility, so this client is not a safe LPN assignment.</w:t>
+        <w:t xml:space="preserve">A client just transferred from the post-anesthesia care unit needs the initial comprehensive postoperative assessment and frequent reassessment for airway, bleeding, and hemodynamic changes, which require registered nurse assessment and judgment rather than a practical nurse assignment.</w:t>
       </w:r>
     </w:p>
     <w:p>
@@ -2163,7 +2163,7 @@
         <w:t xml:space="preserve">Teaching point: </w:t>
       </w:r>
       <w:r>
-        <w:t xml:space="preserve">Assign the practical nurse to stable clients with predictable outcomes and established care plans; keep new admissions, unstable clients, and high-risk therapies such as blood transfusion with the registered nurse.</w:t>
+        <w:t xml:space="preserve">Assign the practical nurse to stable clients with predictable outcomes and established care plans; keep new admissions, clients just out of surgery, and clients whose condition is not yet established with the registered nurse.</w:t>
       </w:r>
     </w:p>
     <w:p>
@@ -2175,7 +2175,7 @@
           <w:sz w:val="18"/>
           <w:szCs w:val="18"/>
         </w:rPr>
-        <w:t xml:space="preserve">References: ANA and NCSBN National Guidelines for Nursing Delegation; AABB blood transfusion standards</w:t>
+        <w:t xml:space="preserve">References: ANA and NCSBN National Guidelines for Nursing Delegation; NCSBN Practical Nurse Scope of Practice</w:t>
       </w:r>
     </w:p>
     <w:p>
@@ -2746,7 +2746,7 @@
         <w:t xml:space="preserve">B — correct: </w:t>
       </w:r>
       <w:r>
-        <w:t xml:space="preserve">C. difficile forms spores that resist alcohol; the friction of washing with soap and water followed by rinsing physically removes the spores from the hands, which is why soap and water is preferred in this setting.</w:t>
+        <w:t xml:space="preserve">C. difficile forms spores that resist alcohol; the friction of washing with soap and water for at least twenty seconds, followed by rinsing, physically removes the spores from the hands, which is why soap and water is preferred after caring for a client with this infection.</w:t>
       </w:r>
     </w:p>
     <w:p>
@@ -3450,7 +3450,7 @@
         <w:t xml:space="preserve">B.  </w:t>
       </w:r>
       <w:r>
-        <w:t xml:space="preserve">I will store the spare oxygen cylinders lying on their sides in the hall closet.</w:t>
+        <w:t xml:space="preserve">I will keep the spare oxygen cylinders in the utility closet next to the furnace so they are out of the way.</w:t>
       </w:r>
     </w:p>
     <w:p>
@@ -3522,7 +3522,7 @@
         <w:t xml:space="preserve">B — incorrect: </w:t>
       </w:r>
       <w:r>
-        <w:t xml:space="preserve">Oxygen cylinders must be secured upright in a stand or cart in a well-ventilated area away from heat; a loose cylinder can be knocked over and become a dangerous projectile if the valve breaks.</w:t>
+        <w:t xml:space="preserve">Oxygen cylinders must be stored at least ten feet from any heat source or open flame, including a furnace, water heater, or stove, in a well-ventilated area and secured so they cannot fall; a closet beside a furnace fails both the heat and ventilation rules.</w:t>
       </w:r>
     </w:p>
     <w:p>
@@ -3557,7 +3557,7 @@
         <w:t xml:space="preserve">Teaching point: </w:t>
       </w:r>
       <w:r>
-        <w:t xml:space="preserve">Home oxygen teaching centers on fire prevention: no smoking or open flames near the oxygen, keep tubing and cylinders away from heat sources, use water-based skin products, and secure cylinders upright.</w:t>
+        <w:t xml:space="preserve">Home oxygen teaching centers on fire prevention: no smoking or open flames near the oxygen, keep tubing and cylinders at least ten feet from heat sources, use water-based skin products, and secure cylinders so they cannot fall.</w:t>
       </w:r>
     </w:p>
     <w:p>
@@ -3838,7 +3838,7 @@
         <w:t xml:space="preserve">B.  </w:t>
       </w:r>
       <w:r>
-        <w:t xml:space="preserve">Unplug the bed, tag it as defective, and ask biomedical engineering for a replacement bed.</w:t>
+        <w:t xml:space="preserve">Unplug the bed, tag it as defective, report it for repair, and obtain a different bed for the admission.</w:t>
       </w:r>
     </w:p>
     <w:p>
@@ -3910,7 +3910,7 @@
         <w:t xml:space="preserve">B — correct: </w:t>
       </w:r>
       <w:r>
-        <w:t xml:space="preserve">Damaged electrical equipment must be removed from service immediately, labelled so no one else uses it, and reported to biomedical engineering; a safe replacement is obtained for the client.</w:t>
+        <w:t xml:space="preserve">Damaged electrical equipment must be removed from service immediately, labeled so no one else uses it, and reported to biomedical engineering or maintenance for repair; the nurse then obtains a safe bed so the admission is not delayed.</w:t>
       </w:r>
     </w:p>
     <w:p>
@@ -4032,7 +4032,7 @@
         <w:t xml:space="preserve">B.  </w:t>
       </w:r>
       <w:r>
-        <w:t xml:space="preserve">Holds the bottle of sterile saline about six inches above the sterile basin while pouring.</w:t>
+        <w:t xml:space="preserve">Holds the saline bottle with the label facing the palm of the hand and pours slowly into the sterile basin.</w:t>
       </w:r>
     </w:p>
     <w:p>
@@ -4051,7 +4051,7 @@
         <w:t xml:space="preserve">C.  </w:t>
       </w:r>
       <w:r>
-        <w:t xml:space="preserve">Turns away from the sterile field to answer a family member's question, then turns back to continue.</w:t>
+        <w:t xml:space="preserve">Notices that spilled saline has soaked through the sterile drape onto the table, blots the spot with sterile gauze, and continues.</w:t>
       </w:r>
     </w:p>
     <w:p>
@@ -4104,7 +4104,7 @@
         <w:t xml:space="preserve">B — incorrect: </w:t>
       </w:r>
       <w:r>
-        <w:t xml:space="preserve">Pouring from a height of four to six inches keeps the unsterile bottle from touching the sterile basin while limiting splashing, so this technique is acceptable.</w:t>
+        <w:t xml:space="preserve">Keeping the label toward the palm protects it from drips so it stays readable, and pouring slowly limits splashing that could wet the field; this is correct technique.</w:t>
       </w:r>
     </w:p>
     <w:p>
@@ -4124,7 +4124,7 @@
         <w:t xml:space="preserve">C — correct: </w:t>
       </w:r>
       <w:r>
-        <w:t xml:space="preserve">A sterile field must stay within the nurse's line of sight at all times; once the nurse turns away, contamination could occur unnoticed, so the field is considered contaminated and must be set up again.</w:t>
+        <w:t xml:space="preserve">When moisture soaks through the drape, it wicks microorganisms up from the unsterile table surface, a process called strike-through; blotting does not undo this, so the field is contaminated and must be discarded and set up again with fresh supplies.</w:t>
       </w:r>
     </w:p>
     <w:p>
@@ -4139,7 +4139,7 @@
         <w:t xml:space="preserve">Teaching point: </w:t>
       </w:r>
       <w:r>
-        <w:t xml:space="preserve">Surgical asepsis rules to remember: keep the field in view and above waist level, do not reach across it, treat the one-inch border as unsterile, and consider anything out of sight or wet to be contaminated.</w:t>
+        <w:t xml:space="preserve">Surgical asepsis rules to remember: keep the field in view and above waist level, do not reach across it, treat the one-inch border as unsterile, and consider anything out of sight or wet to be contaminated, because moisture carries organisms through a drape by strike-through.</w:t>
       </w:r>
     </w:p>
     <w:p>
@@ -4382,7 +4382,7 @@
           <w:b/>
           <w:bCs/>
         </w:rPr>
-        <w:t xml:space="preserve">A nurse on a rehabilitation unit plans to move a client who weighs one hundred thirty kilograms (about two hundred eighty-five pounds) from the bed to a wheelchair with the help of an unlicensed assistive personnel (UAP). The client had a stroke, cannot bear weight on either leg, and does not reliably follow directions. Which transfer method should the nurse choose?</w:t>
+        <w:t xml:space="preserve">A nurse on a rehabilitation unit plans to move a client who weighs one hundred thirty kilograms (about two hundred eighty-seven pounds) from the bed to a wheelchair with the help of an unlicensed assistive personnel (UAP). The client had a stroke, cannot bear weight on either leg, and does not reliably follow directions. Which transfer method should the nurse choose?</w:t>
       </w:r>
     </w:p>
     <w:p>
@@ -5351,7 +5351,7 @@
           <w:sz w:val="18"/>
           <w:szCs w:val="18"/>
         </w:rPr>
-        <w:t xml:space="preserve">References: AAP and AHA Neonatal Resuscitation Program guidelines</w:t>
+        <w:t xml:space="preserve">References: AAP and ACOG Guidelines for Perinatal Care; AWHONN Assessment and Care of the Late Preterm and Term Newborn</w:t>
       </w:r>
     </w:p>
     <w:p>
@@ -5620,7 +5620,7 @@
         <w:t xml:space="preserve">B.  </w:t>
       </w:r>
       <w:r>
-        <w:t xml:space="preserve">Delirium caused by an acute illness such as a urinary tract infection.</w:t>
+        <w:t xml:space="preserve">Delirium from an acute medical cause, such as an infection or dehydration.</w:t>
       </w:r>
     </w:p>
     <w:p>
@@ -5692,7 +5692,7 @@
         <w:t xml:space="preserve">B — correct: </w:t>
       </w:r>
       <w:r>
-        <w:t xml:space="preserve">A change in cognition and alertness that develops over hours to days is delirium until proven otherwise, and infection is a leading cause in older adults. Cloudy urine, falls, and confusion fit an atypical presentation of infection, which often occurs without fever in this age group.</w:t>
+        <w:t xml:space="preserve">A change in cognition and alertness that develops over hours to days is delirium until proven otherwise, and acute illness is a leading cause in older adults, who often present without fever. The daughter's description of the urine raises concern for a urinary tract infection, but cloudy or strong-smelling urine alone does not confirm one, because bacteriuria without infection is common at this age. The new confusion, drowsiness, and fall call for prompt medical evaluation of infection, hydration, medications, and injury from the fall rather than acceptance of a chronic explanation.</w:t>
       </w:r>
     </w:p>
     <w:p>
@@ -5727,7 +5727,7 @@
         <w:t xml:space="preserve">Teaching point: </w:t>
       </w:r>
       <w:r>
-        <w:t xml:space="preserve">Older adults often present infection atypically, with confusion, drowsiness, or falls instead of fever. Acute onset over days means delirium, which is a medical emergency, not normal aging or dementia.</w:t>
+        <w:t xml:space="preserve">Older adults often present acute illness atypically, with confusion, drowsiness, or falls instead of fever. Acute onset over days means delirium, a medical emergency that needs a full search for the cause, including infection, dehydration, and medications; urine odor or cloudiness alone does not diagnose a urinary tract infection.</w:t>
       </w:r>
     </w:p>
     <w:p>
@@ -5739,7 +5739,7 @@
           <w:sz w:val="18"/>
           <w:szCs w:val="18"/>
         </w:rPr>
-        <w:t xml:space="preserve">References: American Geriatrics Society delirium guidance; Hartford Institute for Geriatric Nursing, Confusion Assessment Method</w:t>
+        <w:t xml:space="preserve">References: American Geriatrics Society delirium guidance; Hartford Institute for Geriatric Nursing, Confusion Assessment Method; IDSA guideline on asymptomatic bacteriuria (2019, reaffirmed 2024)</w:t>
       </w:r>
     </w:p>
     <w:p>
@@ -6164,7 +6164,7 @@
           <w:b/>
           <w:bCs/>
         </w:rPr>
-        <w:t xml:space="preserve">A 66-year-old client with well-controlled hypertension asks the clinic nurse about vaccines. The record shows an influenza vaccine last fall, a tetanus-diphtheria booster four years ago, and completed pneumococcal vaccination last year. The client has not received a zoster vaccine. Which statement by the client indicates understanding of the nurse's teaching?</w:t>
+        <w:t xml:space="preserve">A 66-year-old client with well-controlled hypertension asks the clinic nurse about vaccines. The record shows an influenza vaccine last fall, a tetanus-diphtheria booster four years ago, completed pneumococcal vaccination last year, and no zoster vaccine. Which statement by the client indicates understanding of the nurse's teaching?</w:t>
       </w:r>
     </w:p>
     <w:p>
@@ -6274,7 +6274,7 @@
         <w:t xml:space="preserve">B — incorrect: </w:t>
       </w:r>
       <w:r>
-        <w:t xml:space="preserve">Tetanus and diphtheria boosters are given every ten years in adults, or sooner only after a dirty wound. A booster four years ago is current, so this statement shows a misunderstanding of the interval.</w:t>
+        <w:t xml:space="preserve">Adults receive a tetanus and diphtheria booster, as Td or Tdap, every ten years; an earlier dose is given only as part of wound care when five or more years have passed since the last dose. A booster four years ago is current, so this statement shows a misunderstanding of the interval.</w:t>
       </w:r>
     </w:p>
     <w:p>
@@ -6294,7 +6294,7 @@
         <w:t xml:space="preserve">C — correct: </w:t>
       </w:r>
       <w:r>
-        <w:t xml:space="preserve">The recombinant zoster vaccine is recommended for all adults 50 and older as a two-dose series given two to six months apart, regardless of a prior history of shingles. This client has not been vaccinated and is due now.</w:t>
+        <w:t xml:space="preserve">The recombinant zoster vaccine is recommended for all adults 50 and older as a two-dose series given two to six months apart, regardless of a prior episode of shingles or an earlier live zoster vaccine. This client has not been vaccinated and is due now.</w:t>
       </w:r>
     </w:p>
     <w:p>
@@ -6571,7 +6571,7 @@
         <w:t xml:space="preserve">A.  </w:t>
       </w:r>
       <w:r>
-        <w:t xml:space="preserve">Eliminate all carbohydrate foods from the diet and check a fingerstick glucose every morning.</w:t>
+        <w:t xml:space="preserve">Follow a very low carbohydrate diet and check a fingerstick glucose every morning.</w:t>
       </w:r>
     </w:p>
     <w:p>
@@ -6590,7 +6590,7 @@
         <w:t xml:space="preserve">B.  </w:t>
       </w:r>
       <w:r>
-        <w:t xml:space="preserve">Reach a normal body weight before starting any exercise program to protect the joints.</w:t>
+        <w:t xml:space="preserve">Reach a normal body weight before beginning an exercise program to protect the joints.</w:t>
       </w:r>
     </w:p>
     <w:p>
@@ -6642,7 +6642,7 @@
         <w:t xml:space="preserve">A — incorrect: </w:t>
       </w:r>
       <w:r>
-        <w:t xml:space="preserve">Eliminating an entire food group is not sustainable and is not what prevention evidence supports; balanced calorie reduction is. Daily glucose checks are not needed in prediabetes and do not by themselves lower risk.</w:t>
+        <w:t xml:space="preserve">Prevention evidence comes from a moderate calorie reduction within an eating pattern the client can keep up, and an extreme restriction of one food group is hard to sustain and is not required. Daily fingerstick glucose checks are not recommended in prediabetes and do not by themselves lower the risk of progression.</w:t>
       </w:r>
     </w:p>
     <w:p>
@@ -6940,7 +6940,7 @@
           <w:b/>
           <w:bCs/>
         </w:rPr>
-        <w:t xml:space="preserve">A registered nurse is coordinating a community blood pressure screening at a senior center and is working with assistive personnel (AP) who have been trained and validated in using the automated blood pressure device. Which task is appropriate for the nurse to delegate to the assistive personnel?</w:t>
+        <w:t xml:space="preserve">A registered nurse is coordinating a community blood pressure screening at a senior center and is working with assistive personnel who have been trained and validated in using the automated blood pressure device. Which task is appropriate for the nurse to delegate to the assistive personnel?</w:t>
       </w:r>
     </w:p>
     <w:p>
@@ -7172,7 +7172,7 @@
         <w:t xml:space="preserve">B.  </w:t>
       </w:r>
       <w:r>
-        <w:t xml:space="preserve">Only two wet diapers during the past 24 hours.</w:t>
+        <w:t xml:space="preserve">Two wet diapers during the past 24 hours.</w:t>
       </w:r>
     </w:p>
     <w:p>
@@ -7224,7 +7224,7 @@
         <w:t xml:space="preserve">A — incorrect: </w:t>
       </w:r>
       <w:r>
-        <w:t xml:space="preserve">Breastfed newborns are expected to lose up to seven percent of birth weight in the first days; loss beyond seven to ten percent is what prompts evaluation of feeding. Six percent on day three is within the expected range and should begin to reverse as milk volume increases.</w:t>
+        <w:t xml:space="preserve">Breastfed newborns commonly lose up to seven percent of birth weight in the first days; a loss of more than seven percent prompts a feeding evaluation, and more than ten percent calls for intervention. Six percent on day three is within the expected range and should begin to reverse as milk volume increases.</w:t>
       </w:r>
     </w:p>
     <w:p>
@@ -7546,7 +7546,7 @@
           <w:b/>
           <w:bCs/>
         </w:rPr>
-        <w:t xml:space="preserve">A parent brings a four-month-old infant to the emergency department, stating that the baby rolled off the couch yesterday and has been fussy since. While taking the history, the nurse examines the infant. Which finding is most consistent with non-accidental injury and obligates the nurse to follow mandated reporting procedures?</w:t>
+        <w:t xml:space="preserve">A parent brings a six-month-old infant who does not yet crawl to the emergency department, stating that the baby rolled off the couch yesterday and has been fussy since. While taking the history, the nurse examines the infant. Which finding is most consistent with non-accidental injury and obligates the nurse to follow mandated reporting procedures?</w:t>
       </w:r>
     </w:p>
     <w:p>
@@ -7565,7 +7565,7 @@
         <w:t xml:space="preserve">A.  </w:t>
       </w:r>
       <w:r>
-        <w:t xml:space="preserve">Bruises of several different colors on the infant's back and buttocks.</w:t>
+        <w:t xml:space="preserve">Several bruises scattered across the infant's back and buttocks.</w:t>
       </w:r>
     </w:p>
     <w:p>
@@ -7636,7 +7636,7 @@
         <w:t xml:space="preserve">A — correct: </w:t>
       </w:r>
       <w:r>
-        <w:t xml:space="preserve">An infant who cannot yet crawl or cruise rarely bruises at all, and multiple bruises of different ages on protected areas such as the back, buttocks, or torso are sentinel injuries for physical abuse that a nurse is legally required to report.</w:t>
+        <w:t xml:space="preserve">An infant who cannot yet crawl or cruise rarely bruises at all, and multiple bruises on padded, protected areas such as the back, buttocks, or torso do not result from a single fall; they are sentinel injuries for physical abuse that a nurse is legally required to report. Bruise color cannot reliably date an injury, so the number and location of bruises, not their colors, are what raise suspicion.</w:t>
       </w:r>
     </w:p>
     <w:p>
@@ -7656,7 +7656,7 @@
         <w:t xml:space="preserve">B — incorrect: </w:t>
       </w:r>
       <w:r>
-        <w:t xml:space="preserve">One bruise on a bony prominence that matches the reported fall is far less specific for abuse; it should still be documented and evaluated because any bruise in a non-mobile infant deserves scrutiny, but it does not by itself establish a pattern of inflicted injury.</w:t>
+        <w:t xml:space="preserve">One bruise on a bony prominence that matches the reported fall is far less specific for abuse; it should still be documented and evaluated because any bruise in an infant who is not yet mobile deserves scrutiny, but it does not by itself establish a pattern of inflicted injury.</w:t>
       </w:r>
     </w:p>
     <w:p>
@@ -7691,7 +7691,7 @@
         <w:t xml:space="preserve">Teaching point: </w:t>
       </w:r>
       <w:r>
-        <w:t xml:space="preserve">Injuries that do not fit the child's developmental ability or the story given, especially multiple bruises of different ages in a non-mobile infant, are red flags for abuse, and nurses are mandated reporters who report reasonable suspicion rather than proof.</w:t>
+        <w:t xml:space="preserve">Injuries that do not fit the child's developmental ability or the story given, especially multiple bruises on the torso, back, or buttocks of an infant who is not yet crawling, are red flags for abuse, and nurses are mandated reporters who report reasonable suspicion rather than proof.</w:t>
       </w:r>
     </w:p>
     <w:p>
@@ -7850,7 +7850,7 @@
         <w:t xml:space="preserve">B — incorrect: </w:t>
       </w:r>
       <w:r>
-        <w:t xml:space="preserve">Sepsis can raise the heart rate, but it typically brings fever and a falling blood pressure, and it does not explain tremor or tactile hallucinations within forty-eight hours of the last drink.</w:t>
+        <w:t xml:space="preserve">Sepsis can raise the heart rate, but it usually brings fever or a low temperature with a normal or falling blood pressure rather than hypertension, and it does not explain tremor or tactile hallucinations appearing forty-eight hours after the last drink.</w:t>
       </w:r>
     </w:p>
     <w:p>
@@ -8166,7 +8166,7 @@
         <w:t xml:space="preserve">B.  </w:t>
       </w:r>
       <w:r>
-        <w:t xml:space="preserve">Reassure the parents that they are young and healthy and can try for another pregnancy soon.</w:t>
+        <w:t xml:space="preserve">Reassure the parents that they are healthy and can try for another pregnancy soon.</w:t>
       </w:r>
     </w:p>
     <w:p>
@@ -8218,7 +8218,7 @@
         <w:t xml:space="preserve">A — incorrect: </w:t>
       </w:r>
       <w:r>
-        <w:t xml:space="preserve">Removing the infant quickly denies the parents the chance to make the loss real and to say goodbye, which is associated with more complicated grief; the decision to see the baby belongs to the parents.</w:t>
+        <w:t xml:space="preserve">Removing the infant quickly takes away the parents' chance to make the loss real and to say goodbye; most bereaved parents later say they valued that time, and current obstetric guidance is that seeing and holding the baby is offered as a choice that belongs to the parents, never decided for them by staff.</w:t>
       </w:r>
     </w:p>
     <w:p>
@@ -8322,7 +8322,7 @@
           <w:b/>
           <w:bCs/>
         </w:rPr>
-        <w:t xml:space="preserve">A home hospice nurse visits a client with end-stage heart failure who now sleeps most of the day and has taken only a few sips of water in the past two days. The client's daughter says, "He is going to starve. Shouldn't we get him an intravenous (IV) line for fluids?" Which response by the nurse is best?</w:t>
+        <w:t xml:space="preserve">A home hospice nurse visits a client with end-stage heart failure who now sleeps most of the day and has taken only a few sips of water in the past two days. The client's daughter says, "He is going to starve. Shouldn't we get him an intravenous line for fluids?" Which response by the nurse is best?</w:t>
       </w:r>
     </w:p>
     <w:p>
@@ -8432,7 +8432,7 @@
         <w:t xml:space="preserve">B — correct: </w:t>
       </w:r>
       <w:r>
-        <w:t xml:space="preserve">This answer gently corrects the misconception, normalizes the decline in intake as an expected part of the dying process, and redirects the daughter toward comfort measures she can provide, such as mouth care and ice chips.</w:t>
+        <w:t xml:space="preserve">This answer gently corrects the misconception, normalizes the decline in intake as an expected part of the dying process, and redirects the daughter toward comfort measures she can provide, such as moistening the lips and mouth with swabs and offering small sips only when he is awake and able to swallow.</w:t>
       </w:r>
     </w:p>
     <w:p>
@@ -8516,7 +8516,7 @@
           <w:b/>
           <w:bCs/>
         </w:rPr>
-        <w:t xml:space="preserve">An eighty-two-year-old client is on day three in the intensive care unit (ICU) after abdominal surgery. Alert on admission, the client is now confused at night, pulls at the intravenous (IV) line, and says people are hiding in the corner of the room. The client's glasses and hearing aids are at home. Which intervention should the nurse include in the plan of care?</w:t>
+        <w:t xml:space="preserve">An eighty-two-year-old client is on day three in the intensive care unit after abdominal surgery. Alert on admission, the client is now confused at night, pulls at the intravenous line, and says people are hiding in the corner of the room. The client's glasses and hearing aids are at home. Which intervention should the nurse include in the plan of care?</w:t>
       </w:r>
     </w:p>
     <w:p>
@@ -8606,7 +8606,7 @@
         <w:t xml:space="preserve">A — correct: </w:t>
       </w:r>
       <w:r>
-        <w:t xml:space="preserve">Restoring sensory input and a normal day-night cycle are core non-drug strategies for delirium; sensory deprivation and disrupted sleep are among the most modifiable causes of confusion in older ICU clients.</w:t>
+        <w:t xml:space="preserve">Restoring sensory input and a normal day-night cycle are core non-drug strategies for delirium; sensory deprivation and disrupted sleep are among the most modifiable causes of confusion in older intensive care clients.</w:t>
       </w:r>
     </w:p>
     <w:p>
@@ -8626,7 +8626,7 @@
         <w:t xml:space="preserve">B — incorrect: </w:t>
       </w:r>
       <w:r>
-        <w:t xml:space="preserve">Benzodiazepines are a well-established cause of delirium in older adults and are avoided for sleep in the ICU; sedating the client would deepen rather than resolve the confusion.</w:t>
+        <w:t xml:space="preserve">Benzodiazepines are a well-established cause of delirium in older adults and are avoided for sleep in intensive care; sedating the client would deepen rather than resolve the confusion.</w:t>
       </w:r>
     </w:p>
     <w:p>
@@ -8800,7 +8800,7 @@
         <w:t xml:space="preserve">A — incorrect: </w:t>
       </w:r>
       <w:r>
-        <w:t xml:space="preserve">Family members lack training in medical terminology, may filter or soften information, and put the client's privacy and autonomy at risk; they should not serve as interpreters for clinical teaching.</w:t>
+        <w:t xml:space="preserve">Federal language access rules allow an accompanying adult to interpret only in an emergency or when the client specifically asks for it; here the son volunteered, and family members lack training in medical terminology, may filter or soften information, and put the client's privacy and autonomy at risk, so the nurse should not rely on him for clinical teaching.</w:t>
       </w:r>
     </w:p>
     <w:p>
@@ -8867,7 +8867,7 @@
           <w:sz w:val="18"/>
           <w:szCs w:val="18"/>
         </w:rPr>
-        <w:t xml:space="preserve">References: HHS National CLAS Standards; Joint Commission patient-centered communication standards</w:t>
+        <w:t xml:space="preserve">References: HHS Section 1557 regulations on language assistance services; HHS National CLAS Standards; Joint Commission patient-centered communication standards</w:t>
       </w:r>
     </w:p>
     <w:p>
@@ -8892,7 +8892,7 @@
           <w:sz w:val="18"/>
           <w:szCs w:val="18"/>
         </w:rPr>
-        <w:t xml:space="preserve">psi-009 · Difficulty: hard · Clinical judgment: Recognize Cues · caregiver strain, elder abuse, dementia, home care</w:t>
+        <w:t xml:space="preserve">psi-009 · Difficulty: hard · Clinical judgment: Recognize Cues · caregiver strain, elder abuse, chemical restraint, dementia, home care</w:t>
       </w:r>
     </w:p>
     <w:p>
@@ -8942,7 +8942,7 @@
         <w:t xml:space="preserve">B.  </w:t>
       </w:r>
       <w:r>
-        <w:t xml:space="preserve">"I have not slept through the night in months, and yesterday I came so close to hitting him."</w:t>
+        <w:t xml:space="preserve">"I give him his bedtime sleeping pill at lunchtime too, so I can get a few hours to myself."</w:t>
       </w:r>
     </w:p>
     <w:p>
@@ -9014,7 +9014,7 @@
         <w:t xml:space="preserve">B — correct: </w:t>
       </w:r>
       <w:r>
-        <w:t xml:space="preserve">Exhaustion combined with a disclosed impulse to strike the client is a warning sign of caregiver role strain at the threshold of elder abuse; the nurse must assess the client's safety now and connect the daughter with respite and support.</w:t>
+        <w:t xml:space="preserve">Giving extra doses of a sedative to a person with dementia for the caregiver's convenience is a chemical restraint, a form of elder mistreatment, and an immediate physical danger from oversedation, falls, and worsening confusion; the nurse must assess the client now, notify the provider, and connect the daughter with respite and support for the exhaustion driving it.</w:t>
       </w:r>
     </w:p>
     <w:p>
@@ -9049,7 +9049,7 @@
         <w:t xml:space="preserve">Teaching point: </w:t>
       </w:r>
       <w:r>
-        <w:t xml:space="preserve">Caregiver exhaustion plus any expressed impulse to harm the dependent person is a red flag for abuse; the nurse assesses the client's safety immediately and treats caregiver strain as a risk to both people, not just a stress complaint.</w:t>
+        <w:t xml:space="preserve">Mistreatment of a dependent older adult is often disguised as a practical coping solution, such as extra sedatives, locked doors, or skipped care; the nurse assesses the client's safety immediately and treats caregiver strain as a risk to both people, not just a stress complaint.</w:t>
       </w:r>
     </w:p>
     <w:p>
@@ -9124,7 +9124,7 @@
         <w:t xml:space="preserve">B.  </w:t>
       </w:r>
       <w:r>
-        <w:t xml:space="preserve">Prepare the as-needed intramuscular (IM) haloperidol that is ordered for agitation.</w:t>
+        <w:t xml:space="preserve">Prepare the as-needed intramuscular haloperidol that is ordered for agitation.</w:t>
       </w:r>
     </w:p>
     <w:p>
@@ -9196,7 +9196,7 @@
         <w:t xml:space="preserve">B — incorrect: </w:t>
       </w:r>
       <w:r>
-        <w:t xml:space="preserve">Chemical restraint is a later step reserved for agitation that verbal strategies and oral medication have not controlled; reaching for an injection first skips the least restrictive interventions.</w:t>
+        <w:t xml:space="preserve">An intramuscular antipsychotic is a later step reserved for agitation that verbal strategies and offered oral medication have not controlled; reaching for an injection first skips the least restrictive interventions, and a drug given to control behavior rather than to treat the condition counts as a chemical restraint under federal rules.</w:t>
       </w:r>
     </w:p>
     <w:p>
@@ -9462,7 +9462,7 @@
           <w:b/>
           <w:bCs/>
         </w:rPr>
-        <w:t xml:space="preserve">A client admitted to a medical unit after an intentional overdose is on continuous one-to-one observation. The registered nurse assigned an assistive personnel (AP) to provide the observation and reviewed the expectations. One hour later the nurse checks on them. Which observation indicates that the assistive personnel needs further instruction?</w:t>
+        <w:t xml:space="preserve">A client admitted to a medical unit after an intentional overdose is on continuous one-to-one observation. The registered nurse assigned an assistive personnel to provide the observation and reviewed the expectations. One hour later the nurse checks on them. Which observation indicates that the assistive personnel needs further instruction?</w:t>
       </w:r>
     </w:p>
     <w:p>
@@ -9552,7 +9552,7 @@
         <w:t xml:space="preserve">A — correct: </w:t>
       </w:r>
       <w:r>
-        <w:t xml:space="preserve">One-to-one observation means the client stays in direct sight and within arm's reach at all times, including in the bathroom, because ligature points and privacy make it the highest-risk location; the nurse must correct this immediately.</w:t>
+        <w:t xml:space="preserve">One-to-one observation means the client stays in direct, unobstructed view at all times, including in the bathroom, which is the highest-risk location because of ligature points and privacy; many facility policies also require the observer to stay within arm's reach there, so the nurse must correct this immediately.</w:t>
       </w:r>
     </w:p>
     <w:p>
@@ -9862,7 +9862,7 @@
           <w:sz w:val="18"/>
           <w:szCs w:val="18"/>
         </w:rPr>
-        <w:t xml:space="preserve">bcc-002 · Difficulty: hard · Clinical judgment: Take Action · transfer, stroke, delegation, safety</w:t>
+        <w:t xml:space="preserve">bcc-002 · Difficulty: medium · Clinical judgment: Take Action · transfer, stroke, delegation, safety</w:t>
       </w:r>
     </w:p>
     <w:p>
@@ -9931,7 +9931,7 @@
         <w:t xml:space="preserve">C.  </w:t>
       </w:r>
       <w:r>
-        <w:t xml:space="preserve">Place the wheelchair on the client's right side, lock the brakes, and have the client pivot on the stronger leg.</w:t>
+        <w:t xml:space="preserve">Place the wheelchair on the client's right side, lock the brakes and have the client pivot on the right leg.</w:t>
       </w:r>
     </w:p>
     <w:p>
@@ -10281,7 +10281,7 @@
         <w:t xml:space="preserve">A.  </w:t>
       </w:r>
       <w:r>
-        <w:t xml:space="preserve">Sit the client fully upright with the chin slightly tucked and place food on the left side of the mouth.</w:t>
+        <w:t xml:space="preserve">Sit the client fully upright for the meal and place small bites of food on the left side of the mouth.</w:t>
       </w:r>
     </w:p>
     <w:p>
@@ -10352,7 +10352,7 @@
         <w:t xml:space="preserve">A — correct: </w:t>
       </w:r>
       <w:r>
-        <w:t xml:space="preserve">An upright position with a chin tuck helps protect the airway during the swallow, and placing food on the unaffected side lets the client feel and control the bolus. Together these measures reduce pocketing and aspiration.</w:t>
+        <w:t xml:space="preserve">An upright position at ninety degrees helps protect the airway during the swallow, and placing small bites on the unaffected left side lets the client feel and control the bolus. Together these measures reduce pocketing and aspiration.</w:t>
       </w:r>
     </w:p>
     <w:p>
@@ -10407,7 +10407,7 @@
         <w:t xml:space="preserve">Teaching point: </w:t>
       </w:r>
       <w:r>
-        <w:t xml:space="preserve">For dysphagia after stroke: upright at ninety degrees, chin slightly tucked, small bites placed on the unaffected side, no straws unless approved, and remain upright for at least thirty minutes after eating.</w:t>
+        <w:t xml:space="preserve">For dysphagia after stroke: upright at ninety degrees, small bites placed on the unaffected side, no straws unless approved, remain upright for at least thirty minutes after eating, and use compensatory maneuvers such as a chin tuck only when the speech-language pathologist has prescribed them.</w:t>
       </w:r>
     </w:p>
     <w:p>
@@ -10456,7 +10456,7 @@
           <w:b/>
           <w:bCs/>
         </w:rPr>
-        <w:t xml:space="preserve">A parent brings a fourteen-month-old toddler with two days of vomiting and watery diarrhea to a pediatric clinic. The toddler is alert with moist mucous membranes and is assessed as mildly dehydrated. The nurse teaches the parent about oral rehydration at home. Which statement by the parent indicates understanding of the teaching?</w:t>
+        <w:t xml:space="preserve">A parent brings their fourteen-month-old daughter with two days of vomiting and watery diarrhea to a pediatric clinic. The toddler is alert with moist mucous membranes and is assessed as mildly dehydrated. The nurse teaches the parent about oral rehydration at home. Which statement by the parent indicates understanding of the teaching?</w:t>
       </w:r>
     </w:p>
     <w:p>
@@ -10494,7 +10494,7 @@
         <w:t xml:space="preserve">B.  </w:t>
       </w:r>
       <w:r>
-        <w:t xml:space="preserve">I will give small amounts of oral rehydration solution every few minutes and continue her usual foods as she tolerates them.</w:t>
+        <w:t xml:space="preserve">I will give small sips of oral rehydration solution every few minutes and keep offering her usual foods.</w:t>
       </w:r>
     </w:p>
     <w:p>
@@ -10669,7 +10669,7 @@
         <w:t xml:space="preserve">A.  </w:t>
       </w:r>
       <w:r>
-        <w:t xml:space="preserve">A stage 1 pressure injury that requires the area to be offloaded right away.</w:t>
+        <w:t xml:space="preserve">A stage one pressure injury that requires the area to be offloaded right away.</w:t>
       </w:r>
     </w:p>
     <w:p>
@@ -10740,7 +10740,7 @@
         <w:t xml:space="preserve">A — correct: </w:t>
       </w:r>
       <w:r>
-        <w:t xml:space="preserve">Intact skin with nonblanchable redness over a bony prominence defines a stage 1 pressure injury. Because tissue damage has already begun, the area must be kept free of pressure and the prevention plan intensified.</w:t>
+        <w:t xml:space="preserve">Intact skin with nonblanchable redness over a bony prominence defines a stage one pressure injury. Because tissue damage has already begun, the area must be kept free of pressure and the prevention plan intensified.</w:t>
       </w:r>
     </w:p>
     <w:p>
@@ -10780,7 +10780,7 @@
         <w:t xml:space="preserve">C — incorrect: </w:t>
       </w:r>
       <w:r>
-        <w:t xml:space="preserve">Deep tissue pressure injury presents as persistent purple or maroon discoloration or a blood-filled blister, not simple redness. Reddened intact skin that does not blanch is classified as stage 1.</w:t>
+        <w:t xml:space="preserve">Deep tissue pressure injury presents as persistent purple or maroon discoloration or a blood-filled blister, not simple redness. Reddened intact skin that does not blanch is classified as stage one.</w:t>
       </w:r>
     </w:p>
     <w:p>
@@ -10795,7 +10795,7 @@
         <w:t xml:space="preserve">Teaching point: </w:t>
       </w:r>
       <w:r>
-        <w:t xml:space="preserve">The blanch test separates harmless reactive hyperemia from a stage 1 pressure injury. Nonblanchable redness over a bony prominence means damage has started, so offload the area, reposition on schedule and reassess skin at every turn.</w:t>
+        <w:t xml:space="preserve">The blanch test separates harmless reactive hyperemia from a stage one pressure injury. Nonblanchable redness over a bony prominence means damage has started, so offload the area, reposition on schedule and reassess skin at every turn.</w:t>
       </w:r>
     </w:p>
     <w:p>
@@ -10832,7 +10832,7 @@
           <w:sz w:val="18"/>
           <w:szCs w:val="18"/>
         </w:rPr>
-        <w:t xml:space="preserve">bcc-007 · Difficulty: medium · Clinical judgment: Generate Solutions · labor, back pain, comfort measures, maternity</w:t>
+        <w:t xml:space="preserve">bcc-007 · Difficulty: hard · Clinical judgment: Generate Solutions · labor, back pain, comfort measures, maternity</w:t>
       </w:r>
     </w:p>
     <w:p>
@@ -10882,7 +10882,7 @@
         <w:t xml:space="preserve">B.  </w:t>
       </w:r>
       <w:r>
-        <w:t xml:space="preserve">Apply firm, steady counterpressure to the sacrum during contractions and encourage a hands-and-knees position.</w:t>
+        <w:t xml:space="preserve">Perform light effleurage over the abdomen and dim the lights to promote relaxation.</w:t>
       </w:r>
     </w:p>
     <w:p>
@@ -10901,7 +10901,7 @@
         <w:t xml:space="preserve">C.  </w:t>
       </w:r>
       <w:r>
-        <w:t xml:space="preserve">Perform light effleurage over the abdomen and dim the lights to promote relaxation.</w:t>
+        <w:t xml:space="preserve">Apply firm counterpressure to the sacrum during contractions and suggest a hands-and-knees position.</w:t>
       </w:r>
     </w:p>
     <w:p>
@@ -10914,7 +10914,7 @@
           <w:bCs/>
           <w:color w:val="1B6E3A"/>
         </w:rPr>
-        <w:t xml:space="preserve">Correct answer: B</w:t>
+        <w:t xml:space="preserve">Correct answer: C</w:t>
       </w:r>
     </w:p>
     <w:p>
@@ -10949,32 +10949,32 @@
         <w:rPr>
           <w:b/>
           <w:bCs/>
+          <w:color w:val="8A2B2B"/>
+        </w:rPr>
+        <w:t xml:space="preserve">B — incorrect: </w:t>
+      </w:r>
+      <w:r>
+        <w:t xml:space="preserve">Effleurage and a calm environment can ease general labor discomfort, but light abdominal stroking does little for the sacral pressure of an occiput posterior fetus. Back labor calls for measures aimed at the sacrum and fetal position.</w:t>
+      </w:r>
+    </w:p>
+    <w:p>
+      <w:pPr>
+        <w:pStyle w:val="ListParagraph"/>
+        <w:numPr>
+          <w:ilvl w:val="0"/>
+          <w:numId w:val="2"/>
+        </w:numPr>
+      </w:pPr>
+      <w:r>
+        <w:rPr>
+          <w:b/>
+          <w:bCs/>
           <w:color w:val="1B6E3A"/>
         </w:rPr>
-        <w:t xml:space="preserve">B — correct: </w:t>
-      </w:r>
-      <w:r>
-        <w:t xml:space="preserve">Sacral counterpressure directly counters the pressure of the fetal occiput on the sacrum, and the hands-and-knees position uses gravity to encourage the fetus to rotate. These are the first-line comfort measures for back labor.</w:t>
-      </w:r>
-    </w:p>
-    <w:p>
-      <w:pPr>
-        <w:pStyle w:val="ListParagraph"/>
-        <w:numPr>
-          <w:ilvl w:val="0"/>
-          <w:numId w:val="2"/>
-        </w:numPr>
-      </w:pPr>
-      <w:r>
-        <w:rPr>
-          <w:b/>
-          <w:bCs/>
-          <w:color w:val="8A2B2B"/>
-        </w:rPr>
-        <w:t xml:space="preserve">C — incorrect: </w:t>
-      </w:r>
-      <w:r>
-        <w:t xml:space="preserve">Effleurage and a calm environment can ease general labor discomfort, but light abdominal stroking does little for the sacral pressure of an occiput posterior fetus. Back labor calls for measures aimed at the sacrum and fetal position.</w:t>
+        <w:t xml:space="preserve">C — correct: </w:t>
+      </w:r>
+      <w:r>
+        <w:t xml:space="preserve">Sacral counterpressure directly counters the pressure of the fetal occiput on the sacrum, and the hands-and-knees position takes the weight of the fetus off the sacrum and may encourage rotation to an anterior position. These are the first-line comfort measures for back labor.</w:t>
       </w:r>
     </w:p>
     <w:p>
@@ -10989,7 +10989,7 @@
         <w:t xml:space="preserve">Teaching point: </w:t>
       </w:r>
       <w:r>
-        <w:t xml:space="preserve">Match the comfort measure to the cause of the pain: back labor from an occiput posterior fetus responds to sacral counterpressure and positions such as hands-and-knees that relieve sacral pressure and promote fetal rotation.</w:t>
+        <w:t xml:space="preserve">Match the comfort measure to the cause of the pain: back labor from an occiput posterior fetus responds to sacral counterpressure and positions such as hands-and-knees that relieve sacral pressure and may promote fetal rotation.</w:t>
       </w:r>
     </w:p>
     <w:p>
@@ -11076,30 +11076,30 @@
         <w:t xml:space="preserve">B.  </w:t>
       </w:r>
       <w:r>
+        <w:t xml:space="preserve">Encourage daytime activity with daylight exposure and cluster nighttime care to limit interruptions.</w:t>
+      </w:r>
+    </w:p>
+    <w:p>
+      <w:pPr>
+        <w:pStyle w:val="ListParagraph"/>
+        <w:numPr>
+          <w:ilvl w:val="0"/>
+          <w:numId w:val="2"/>
+        </w:numPr>
+      </w:pPr>
+      <w:r>
+        <w:rPr>
+          <w:b/>
+          <w:bCs/>
+        </w:rPr>
+        <w:t xml:space="preserve">C.  </w:t>
+      </w:r>
+      <w:r>
         <w:t xml:space="preserve">Keep the room dim and quiet throughout the day so the client can nap whenever they feel tired.</w:t>
       </w:r>
     </w:p>
     <w:p>
       <w:pPr>
-        <w:pStyle w:val="ListParagraph"/>
-        <w:numPr>
-          <w:ilvl w:val="0"/>
-          <w:numId w:val="2"/>
-        </w:numPr>
-      </w:pPr>
-      <w:r>
-        <w:rPr>
-          <w:b/>
-          <w:bCs/>
-        </w:rPr>
-        <w:t xml:space="preserve">C.  </w:t>
-      </w:r>
-      <w:r>
-        <w:t xml:space="preserve">Encourage daytime activity with daylight exposure and cluster nighttime care to limit interruptions.</w:t>
-      </w:r>
-    </w:p>
-    <w:p>
-      <w:pPr>
         <w:spacing w:after="80" w:before="160"/>
       </w:pPr>
       <w:r>
@@ -11108,7 +11108,7 @@
           <w:bCs/>
           <w:color w:val="1B6E3A"/>
         </w:rPr>
-        <w:t xml:space="preserve">Correct answer: C</w:t>
+        <w:t xml:space="preserve">Correct answer: B</w:t>
       </w:r>
     </w:p>
     <w:p>
@@ -11143,32 +11143,32 @@
         <w:rPr>
           <w:b/>
           <w:bCs/>
+          <w:color w:val="1B6E3A"/>
+        </w:rPr>
+        <w:t xml:space="preserve">B — correct: </w:t>
+      </w:r>
+      <w:r>
+        <w:t xml:space="preserve">Daytime light and activity strengthen the circadian rhythm, while grouping nighttime tasks reduces awakenings. These non-pharmacological measures are the first-line approach to sleep disturbance in hospitalized older adults.</w:t>
+      </w:r>
+    </w:p>
+    <w:p>
+      <w:pPr>
+        <w:pStyle w:val="ListParagraph"/>
+        <w:numPr>
+          <w:ilvl w:val="0"/>
+          <w:numId w:val="2"/>
+        </w:numPr>
+      </w:pPr>
+      <w:r>
+        <w:rPr>
+          <w:b/>
+          <w:bCs/>
           <w:color w:val="8A2B2B"/>
         </w:rPr>
-        <w:t xml:space="preserve">B — incorrect: </w:t>
+        <w:t xml:space="preserve">C — incorrect: </w:t>
       </w:r>
       <w:r>
         <w:t xml:space="preserve">Daytime napping in a dark room weakens the circadian rhythm and makes nighttime sleep even harder. Bright daytime light and activity help reset the sleep-wake cycle.</w:t>
-      </w:r>
-    </w:p>
-    <w:p>
-      <w:pPr>
-        <w:pStyle w:val="ListParagraph"/>
-        <w:numPr>
-          <w:ilvl w:val="0"/>
-          <w:numId w:val="2"/>
-        </w:numPr>
-      </w:pPr>
-      <w:r>
-        <w:rPr>
-          <w:b/>
-          <w:bCs/>
-          <w:color w:val="1B6E3A"/>
-        </w:rPr>
-        <w:t xml:space="preserve">C — correct: </w:t>
-      </w:r>
-      <w:r>
-        <w:t xml:space="preserve">Daytime light and activity strengthen the circadian rhythm, while grouping nighttime tasks reduces awakenings. These non-pharmacological measures are the first-line approach to sleep disturbance in hospitalized older adults.</w:t>
       </w:r>
     </w:p>
     <w:p>
@@ -11821,7 +11821,7 @@
         <w:t xml:space="preserve">A.  </w:t>
       </w:r>
       <w:r>
-        <w:t xml:space="preserve">A client on continuous nasogastric tube feeding who has become restless and whose oxygen saturation has fallen from 97 to 90 percent.</w:t>
+        <w:t xml:space="preserve">A client on continuous nasogastric tube feeding who has become restless with an oxygen saturation of 90 percent.</w:t>
       </w:r>
     </w:p>
     <w:p>
@@ -11912,7 +11912,7 @@
         <w:t xml:space="preserve">B — incorrect: </w:t>
       </w:r>
       <w:r>
-        <w:t xml:space="preserve">Pain and scheduled repositioning are important but not immediately life-threatening. This client can safely wait a few minutes while an airway problem is addressed, and pain management can then be delegated in part or handled next.</w:t>
+        <w:t xml:space="preserve">Pain and scheduled repositioning are important but not immediately life-threatening. This client can safely wait a few minutes while a possible airway problem is addressed, and the nurse then assesses and treats the pain next.</w:t>
       </w:r>
     </w:p>
     <w:p>
@@ -11932,7 +11932,7 @@
         <w:t xml:space="preserve">C — incorrect: </w:t>
       </w:r>
       <w:r>
-        <w:t xml:space="preserve">Opioid-induced constipation needs a bowel regimen and assessment for distention, but it is a stable chronic problem that does not threaten oxygenation. It is the lowest priority of the three.</w:t>
+        <w:t xml:space="preserve">Opioid-induced constipation needs a bowel regimen and assessment for distention, but it is a stable problem that does not threaten oxygenation. It is the lowest priority of the three.</w:t>
       </w:r>
     </w:p>
     <w:p>
@@ -12692,7 +12692,7 @@
         <w:t xml:space="preserve">A — correct: </w:t>
       </w:r>
       <w:r>
-        <w:t xml:space="preserve">Clozapine can cause severe neutropenia, and the first sign is often an infection such as fever with a sore throat. An absolute neutrophil count is needed right away because the drug may have to be held to prevent a life-threatening infection.</w:t>
+        <w:t xml:space="preserve">Clozapine can cause severe neutropenia, and the first sign is often an infection such as fever with a sore throat. An absolute neutrophil count is needed right away because the drug may have to be held to prevent a life-threatening infection. Fever in the first two months of therapy can also be the first sign of clozapine-induced myocarditis, another reason it cannot wait.</w:t>
       </w:r>
     </w:p>
     <w:p>
@@ -12906,7 +12906,7 @@
         <w:t xml:space="preserve">B — incorrect: </w:t>
       </w:r>
       <w:r>
-        <w:t xml:space="preserve">A first dose of an IV antibiotic in a new admission carries an unpredictable risk of reaction and requires an initial assessment, so it stays with the RN. Later doses in a stable client may be appropriate for an LPN where the state practice act permits.</w:t>
+        <w:t xml:space="preserve">A first dose of an IV antibiotic in a new admission carries an unpredictable risk of reaction and requires an initial assessment, so it stays with the RN. Later doses in a stable client may be appropriate for an LPN only where the state practice act and facility policy permit IV medication administration.</w:t>
       </w:r>
     </w:p>
     <w:p>
@@ -13184,7 +13184,7 @@
           <w:b/>
           <w:bCs/>
         </w:rPr>
-        <w:t xml:space="preserve">A client on a surgical unit receiving hydromorphone by patient-controlled analgesia (PCA) was found difficult to arouse with a respiratory rate of six breaths per minute. The nurse stopped the PCA, supported breathing, and gave intravenous (IV) naloxone per protocol. Twenty minutes later the client is awake, breathing sixteen times per minute, and asking for pain medication. Which action should the nurse take next?</w:t>
+        <w:t xml:space="preserve">A client on a surgical unit receiving hydromorphone by patient-controlled analgesia (PCA) was found difficult to arouse with a respiratory rate of six breaths per minute. The nurse stopped the PCA, supported breathing, and gave intravenous (IV) naloxone per protocol. Twenty minutes later the client is awake, breathing sixteen times per minute, and asking for pain medication. How should the nurse interpret the client's current status?</w:t>
       </w:r>
     </w:p>
     <w:p>
@@ -13203,7 +13203,7 @@
         <w:t xml:space="preserve">A.  </w:t>
       </w:r>
       <w:r>
-        <w:t xml:space="preserve">Resume the PCA at the previous settings because the client is alert and reporting pain.</w:t>
+        <w:t xml:space="preserve">The overdose has resolved, so the PCA can be resumed at the previous settings.</w:t>
       </w:r>
     </w:p>
     <w:p>
@@ -13222,7 +13222,7 @@
         <w:t xml:space="preserve">B.  </w:t>
       </w:r>
       <w:r>
-        <w:t xml:space="preserve">Document the reversal and return to the unit's routine every-four-hour vital sign checks.</w:t>
+        <w:t xml:space="preserve">The client is stable and can return to the unit's routine every-four-hour vital sign checks.</w:t>
       </w:r>
     </w:p>
     <w:p>
@@ -13241,7 +13241,7 @@
         <w:t xml:space="preserve">C.  </w:t>
       </w:r>
       <w:r>
-        <w:t xml:space="preserve">Keep checking sedation and breathing frequently because naloxone may wear off before the opioid.</w:t>
+        <w:t xml:space="preserve">The client remains at risk of renewed sedation because naloxone may wear off before the opioid.</w:t>
       </w:r>
     </w:p>
     <w:p>
@@ -13274,7 +13274,7 @@
         <w:t xml:space="preserve">A — incorrect: </w:t>
       </w:r>
       <w:r>
-        <w:t xml:space="preserve">The client just had life-threatening respiratory depression at those settings, so restarting them unchanged invites a repeat. The provider must reassess the opioid dose and the client's pain plan before any opioid is resumed.</w:t>
+        <w:t xml:space="preserve">The client just had life-threatening respiratory depression at those settings, so an alert client is not proof the problem is over. The provider must reassess the opioid dose and the client's pain plan before any opioid is resumed.</w:t>
       </w:r>
     </w:p>
     <w:p>
@@ -13314,7 +13314,7 @@
         <w:t xml:space="preserve">C — correct: </w:t>
       </w:r>
       <w:r>
-        <w:t xml:space="preserve">Naloxone acts for roughly thirty to ninety minutes, while hydromorphone and other opioids last longer, so respiratory depression can recur. Close, frequent observation of sedation level and respirations continues until the opioid effect has clearly passed.</w:t>
+        <w:t xml:space="preserve">Naloxone acts for roughly thirty to ninety minutes, while hydromorphone and other opioids last longer, so respiratory depression can recur. The improvement is real but temporary, and close, frequent observation of sedation level and respirations continues until the opioid effect has clearly passed.</w:t>
       </w:r>
     </w:p>
     <w:p>
@@ -13896,7 +13896,7 @@
         <w:t xml:space="preserve">C — correct: </w:t>
       </w:r>
       <w:r>
-        <w:t xml:space="preserve">Nitrates and phosphodiesterase inhibitors both raise nitric oxide signaling, and together they can cause profound hypotension and cardiovascular collapse. The nurse holds the nitrate and alerts the provider so alternative chest pain treatment can be chosen.</w:t>
+        <w:t xml:space="preserve">Nitrates supply nitric oxide and phosphodiesterase inhibitors block the breakdown of the cyclic GMP it produces, so together they can cause profound hypotension and cardiovascular collapse. The nurse holds the nitrate and alerts the provider so alternative chest pain treatment can be chosen.</w:t>
       </w:r>
     </w:p>
     <w:p>
@@ -14264,7 +14264,7 @@
         <w:t xml:space="preserve">B — correct: </w:t>
       </w:r>
       <w:r>
-        <w:t xml:space="preserve">Vancomycin infused too quickly triggers direct histamine release, producing flushing and itching of the face, neck and upper trunk. This vancomycin infusion reaction is not a true allergy and resolves when the infusion is slowed or paused and given over a longer time, often with an antihistamine.</w:t>
+        <w:t xml:space="preserve">Vancomycin infused too quickly triggers direct histamine release, producing flushing and itching of the face, neck and upper trunk. This reaction, now called vancomycin flushing syndrome and formerly red man syndrome, is not a true allergy and resolves when the infusion is slowed or paused and given over a longer time, often with an antihistamine.</w:t>
       </w:r>
     </w:p>
     <w:p>
@@ -14422,7 +14422,7 @@
         <w:t xml:space="preserve">B.  </w:t>
       </w:r>
       <w:r>
-        <w:t xml:space="preserve">A blood glucose of 148 milligrams per deciliter drawn before breakfast.</w:t>
+        <w:t xml:space="preserve">A blood glucose of 148 milligrams per deciliter on the morning draw.</w:t>
       </w:r>
     </w:p>
     <w:p>
@@ -14494,7 +14494,7 @@
         <w:t xml:space="preserve">B — incorrect: </w:t>
       </w:r>
       <w:r>
-        <w:t xml:space="preserve">Mild hyperglycemia after surgery is a common stress response, especially in a client receiving IV fluids, and it warrants monitoring rather than urgent action.</w:t>
+        <w:t xml:space="preserve">Mild hyperglycemia after surgery is a common stress response; it warrants monitoring and possibly correction insulin, but it is not an immediate threat to the client.</w:t>
       </w:r>
     </w:p>
     <w:p>
@@ -15250,7 +15250,7 @@
         <w:t xml:space="preserve">A — incorrect: </w:t>
       </w:r>
       <w:r>
-        <w:t xml:space="preserve">Opioids can cause confusion and slow breathing, but they do not produce rapid breathing, hypoxemia, or a petechial rash, so they do not explain the full picture.</w:t>
+        <w:t xml:space="preserve">Opioids can cause confusion and slow, shallow breathing, but they do not produce a rapid respiratory rate or a petechial rash, so they do not explain the full picture.</w:t>
       </w:r>
     </w:p>
     <w:p>
@@ -15354,7 +15354,7 @@
           <w:b/>
           <w:bCs/>
         </w:rPr>
-        <w:t xml:space="preserve">A 70-year-old client with stage 3 chronic kidney disease and an estimated glomerular filtration rate of 38 milliliters per minute is scheduled for a computed tomography (CT) scan of the abdomen with intravenous (IV) iodinated contrast to evaluate a suspected abscess. The nurse is planning care to reduce the risk of contrast-associated acute kidney injury. Which intervention should the nurse anticipate including in the plan?</w:t>
+        <w:t xml:space="preserve">A 70-year-old client with stage 4 chronic kidney disease and an estimated glomerular filtration rate of 26 milliliters per minute is scheduled for a computed tomography (CT) scan of the abdomen with intravenous (IV) iodinated contrast to evaluate a suspected abscess. The nurse is planning care to reduce the risk of contrast-associated acute kidney injury. Which intervention should the nurse anticipate including in the plan?</w:t>
       </w:r>
     </w:p>
     <w:p>
@@ -15464,7 +15464,7 @@
         <w:t xml:space="preserve">B — correct: </w:t>
       </w:r>
       <w:r>
-        <w:t xml:space="preserve">Volume expansion with isotonic crystalloid such as normal saline maintains renal perfusion and dilutes the contrast in the tubules, and it is the best-supported measure for preventing contrast-associated kidney injury in high-risk clients.</w:t>
+        <w:t xml:space="preserve">Volume expansion with isotonic crystalloid such as normal saline maintains renal perfusion and dilutes the contrast in the tubules; for clients with an estimated glomerular filtration rate below 30 who are not on dialysis, it is the best-supported measure for preventing contrast-associated kidney injury.</w:t>
       </w:r>
     </w:p>
     <w:p>
@@ -15484,7 +15484,7 @@
         <w:t xml:space="preserve">C — incorrect: </w:t>
       </w:r>
       <w:r>
-        <w:t xml:space="preserve">Dehydration is a major risk factor for contrast-associated kidney injury; modern contrast agents rarely cause vomiting, and any fasting should be brief and offset with IV hydration.</w:t>
+        <w:t xml:space="preserve">Fasting is not required before IV iodinated contrast, and a long period without fluids causes the dehydration that is a major risk factor for contrast-associated kidney injury; modern low-osmolar agents rarely cause vomiting, so this plan adds risk without benefit.</w:t>
       </w:r>
     </w:p>
     <w:p>
@@ -15499,7 +15499,7 @@
         <w:t xml:space="preserve">Teaching point: </w:t>
       </w:r>
       <w:r>
-        <w:t xml:space="preserve">In clients with reduced kidney function, IV isotonic hydration before and after iodinated contrast is the key protective measure; avoid dehydration and diuretics around the study and recheck creatinine within 48 hours.</w:t>
+        <w:t xml:space="preserve">In clients with severely reduced kidney function, IV isotonic hydration before and after iodinated contrast is the key protective measure; avoid dehydration, prolonged fasting, and diuretics around the study, and recheck creatinine within 48 to 72 hours.</w:t>
       </w:r>
     </w:p>
     <w:p>
@@ -15832,7 +15832,7 @@
         <w:t xml:space="preserve">A — correct: </w:t>
       </w:r>
       <w:r>
-        <w:t xml:space="preserve">Submerging the tube end in sterile water creates a temporary water seal that lets air escape from the pleural space while preventing air from being drawn back in, protecting the client until a new sterile system is connected.</w:t>
+        <w:t xml:space="preserve">Submerging the tube end in sterile water creates a temporary water seal that lets air escape from the pleural space while preventing air from being drawn back in; the tube end that touched the linen is contaminated and cannot simply be reconnected, so the water seal protects the client until a new sterile system is connected.</w:t>
       </w:r>
     </w:p>
     <w:p>
@@ -16066,7 +16066,7 @@
         <w:t xml:space="preserve">C — correct: </w:t>
       </w:r>
       <w:r>
-        <w:t xml:space="preserve">A level above 1.5 milliequivalents per liter with coarse tremor, vomiting, or diarrhea indicates lithium toxicity; the drug is held and the provider notified so hydration, repeat levels, and possibly dialysis can be arranged.</w:t>
+        <w:t xml:space="preserve">A level above 1.5 milliequivalents per liter with coarse tremor, vomiting, or diarrhea indicates lithium toxicity; the drug is held and the provider notified so IV fluids, repeat levels, and further treatment can be arranged.</w:t>
       </w:r>
     </w:p>
     <w:p>
@@ -16260,7 +16260,7 @@
         <w:t xml:space="preserve">C — incorrect: </w:t>
       </w:r>
       <w:r>
-        <w:t xml:space="preserve">Fever reflects the infection and its treatment with antibiotics and antipyretics; a lower temperature does not tell the nurse whether circulating volume and perfusion have improved.</w:t>
+        <w:t xml:space="preserve">Fever reflects the infection and begins to respond to antibiotics or to any antipyretic given; a lower temperature does not tell the nurse whether circulating volume and perfusion have improved.</w:t>
       </w:r>
     </w:p>
     <w:p>
@@ -16324,7 +16324,7 @@
           <w:b/>
           <w:bCs/>
         </w:rPr>
-        <w:t xml:space="preserve">A nurse on a surgical unit is performing the shift assessment of a client eight hours after a total thyroidectomy for a large goiter. The neck dressing is dry, the client is resting with the head of the bed raised, and the oxygen saturation is 97 percent on room air. Which finding requires the nurse's immediate follow-up?</w:t>
+        <w:t xml:space="preserve">A nurse on a surgical unit is performing the shift assessment of a client twenty-four hours after a total thyroidectomy for a large goiter. The neck dressing is dry, the client is resting with the head of the bed raised, and the oxygen saturation is 97 percent on room air. Which finding requires the nurse's immediate follow-up?</w:t>
       </w:r>
     </w:p>
     <w:p>
@@ -16608,7 +16608,7 @@
         <w:t xml:space="preserve">A — incorrect: </w:t>
       </w:r>
       <w:r>
-        <w:t xml:space="preserve">Adding more fluid to a bladder that cannot drain worsens distention and pain and can tear the fresh surgical site, so the irrigation is stopped, not sped up, until drainage is restored.</w:t>
+        <w:t xml:space="preserve">Adding more fluid to a bladder that cannot drain worsens distention and pain and can disrupt the fresh surgical site and restart bleeding, so the irrigation is stopped, not sped up, until drainage is restored.</w:t>
       </w:r>
     </w:p>
     <w:p>
@@ -16942,7 +16942,7 @@
           <w:b/>
           <w:bCs/>
         </w:rPr>
-        <w:t xml:space="preserve">A nurse on a medical-surgical unit is caring for a 68-year-old client admitted with three days of vomiting who also takes furosemide daily for heart failure. The morning serum potassium is 2.8 milliequivalents per liter, and the client is on continuous cardiac monitoring. Which finding requires the nurse's immediate follow-up?</w:t>
+        <w:t xml:space="preserve">A nurse on a medical-surgical unit is caring for a 68-year-old client admitted with three days of vomiting who also takes furosemide daily for heart failure. The morning serum potassium is 2.8 milliequivalents per liter. Which finding requires the nurse's immediate follow-up?</w:t>
       </w:r>
     </w:p>
     <w:p>
@@ -16980,7 +16980,7 @@
         <w:t xml:space="preserve">B.  </w:t>
       </w:r>
       <w:r>
-        <w:t xml:space="preserve">The monitor shows flattened T waves with frequent premature ventricular contractions.</w:t>
+        <w:t xml:space="preserve">The cardiac monitor shows flattened T waves with frequent premature ventricular contractions.</w:t>
       </w:r>
     </w:p>
     <w:p>
@@ -17136,7 +17136,7 @@
           <w:b/>
           <w:bCs/>
         </w:rPr>
-        <w:t xml:space="preserve">A client in the intensive care unit (ICU) with septic shock from pneumonia has received a thirty milliliter per kilogram crystalloid bolus. The mean arterial pressure is now 58, heart rate 118, central venous pressure 12, lactate 4.2 millimoles per liter, and the extremities are warm and flushed. Which order should the nurse anticipate next?</w:t>
+        <w:t xml:space="preserve">A client in the intensive care unit (ICU) with septic shock from pneumonia has received a thirty milliliter per kilogram crystalloid bolus. The mean arterial pressure is now 58, heart rate 118, and lactate 4.2 millimoles per liter. A passive leg raise produces no increase in stroke volume, and the extremities are warm and flushed. Which order should the nurse anticipate next?</w:t>
       </w:r>
     </w:p>
     <w:p>
@@ -17226,7 +17226,7 @@
         <w:t xml:space="preserve">A — incorrect: </w:t>
       </w:r>
       <w:r>
-        <w:t xml:space="preserve">The initial bolus is complete and a central venous pressure of 12 suggests preload is adequate, so more fluid risks pulmonary edema without correcting the low vascular resistance that is driving the hypotension.</w:t>
+        <w:t xml:space="preserve">The initial bolus is complete and a passive leg raise that does not increase stroke volume shows the client is no longer fluid responsive, so more fluid risks pulmonary edema without correcting the low vascular resistance that is driving the hypotension.</w:t>
       </w:r>
     </w:p>
     <w:p>
@@ -17281,7 +17281,7 @@
         <w:t xml:space="preserve">Teaching point: </w:t>
       </w:r>
       <w:r>
-        <w:t xml:space="preserve">In septic shock, once a thirty milliliter per kilogram bolus has been given, hypotension that persists is treated with norepinephrine to reach a mean arterial pressure of 65; more fluid or an inotrope is chosen only when the assessment shows low preload or poor contractility.</w:t>
+        <w:t xml:space="preserve">In septic shock, once a thirty milliliter per kilogram bolus has been given, hypotension that persists is treated with norepinephrine to reach a mean arterial pressure of 65; more fluid is given only when a dynamic measure such as a passive leg raise shows fluid responsiveness, and an inotrope only when there is evidence of poor contractility.</w:t>
       </w:r>
     </w:p>
     <w:p>
@@ -17614,7 +17614,7 @@
         <w:t xml:space="preserve">A — correct: </w:t>
       </w:r>
       <w:r>
-        <w:t xml:space="preserve">Daily morning weights on the same scale are the most sensitive early indicator of fluid retention, and reporting a gain of two to three pounds in a day or five pounds in a week allows treatment before breathlessness and hospitalization occur.</w:t>
+        <w:t xml:space="preserve">Daily morning weights on the same scale, after voiding and before breakfast, are the most sensitive early indicator of fluid retention; reporting a gain of about three pounds in a day or five pounds in a week (the thresholds commonly taught) allows treatment before breathlessness and hospitalization occur.</w:t>
       </w:r>
     </w:p>
     <w:p>
@@ -17654,7 +17654,7 @@
         <w:t xml:space="preserve">C — incorrect: </w:t>
       </w:r>
       <w:r>
-        <w:t xml:space="preserve">Clients with heart failure are usually asked to limit fluid to about two liters a day and to restrict sodium, because excess fluid increases the volume the weakened heart must pump.</w:t>
+        <w:t xml:space="preserve">Clients with heart failure are never told to push fluids: every extra liter adds to the volume the weakened heart must pump. Most are asked to limit sodium and, when directed, to keep fluid intake to about two liters a day, especially if the sodium level is low.</w:t>
       </w:r>
     </w:p>
     <w:p>
@@ -17931,7 +17931,7 @@
         <w:t xml:space="preserve">A.  </w:t>
       </w:r>
       <w:r>
-        <w:t xml:space="preserve">Deep tendon reflexes are one plus and the client reports feeling warm and flushed.</w:t>
+        <w:t xml:space="preserve">Deep tendon reflexes are two plus and the client reports feeling warm and flushed.</w:t>
       </w:r>
     </w:p>
     <w:p>
@@ -18002,7 +18002,7 @@
         <w:t xml:space="preserve">A — incorrect: </w:t>
       </w:r>
       <w:r>
-        <w:t xml:space="preserve">Diminished but present reflexes and a sensation of warmth are expected effects of a therapeutic magnesium level; they should be documented and trended, not treated as toxicity.</w:t>
+        <w:t xml:space="preserve">Normal two plus reflexes show that magnesium has not reached a toxic level, and a sensation of warmth and flushing is an expected effect of the infusion; these findings are documented and trended, not treated as toxicity.</w:t>
       </w:r>
     </w:p>
     <w:p>
@@ -18057,7 +18057,7 @@
         <w:t xml:space="preserve">Teaching point: </w:t>
       </w:r>
       <w:r>
-        <w:t xml:space="preserve">During a magnesium sulfate infusion, assess reflexes, respirations, and urine output every hour; loss of the patellar reflex, respirations under twelve, or urine output under thirty milliliters per hour signals toxicity, and calcium gluconate is the reversal agent.</w:t>
+        <w:t xml:space="preserve">During a magnesium sulfate infusion, assess reflexes, respirations, and urine output every hour; loss of the patellar reflex or respirations under twelve signals toxicity, urine output under thirty milliliters per hour warns that magnesium is accumulating, and calcium gluconate is the reversal agent.</w:t>
       </w:r>
     </w:p>
     <w:p>
@@ -18882,7 +18882,7 @@
           <w:b/>
           <w:bCs/>
         </w:rPr>
-        <w:t xml:space="preserve">A 22-year-old client on an orthopedic unit had an intramedullary rod placed twenty hours ago for a closed femur fracture sustained in a motorcycle crash. The nurse finds the client restless and confused, with a respiratory rate of 30, an oxygen saturation of 89 percent on room air, and a new petechial rash across the chest and axillae. Which complication should the nurse suspect first?</w:t>
+        <w:t xml:space="preserve">A 22-year-old client on an orthopedic unit had an intramedullary rod placed thirty-six hours ago for a closed femur fracture sustained in a motorcycle crash. The nurse finds the client restless and confused, with a respiratory rate of 30, an oxygen saturation of 89 percent on room air, and a new petechial rash across the chest and axillae. Which complication should the nurse suspect first?</w:t>
       </w:r>
     </w:p>
     <w:p>
@@ -18972,7 +18972,7 @@
         <w:t xml:space="preserve">A — incorrect: </w:t>
       </w:r>
       <w:r>
-        <w:t xml:space="preserve">Venous thromboembolism also causes sudden dyspnea and hypoxemia, but it usually develops several days after immobilization and does not produce a petechial rash or the early confusion seen here.</w:t>
+        <w:t xml:space="preserve">Pulmonary embolism from a deep vein thrombosis also causes sudden dyspnea and hypoxemia, but it does not produce a petechial rash, and it more often develops after several days of immobility rather than within the first two days of a long bone fracture.</w:t>
       </w:r>
     </w:p>
     <w:p>
@@ -19012,7 +19012,7 @@
         <w:t xml:space="preserve">C — correct: </w:t>
       </w:r>
       <w:r>
-        <w:t xml:space="preserve">Fat embolism syndrome classically appears twelve to seventy-two hours after a long bone fracture with the triad of respiratory distress, neurologic changes, and petechiae on the chest, axillae, and conjunctivae; it is a life-threatening emergency requiring oxygen and immediate provider notification.</w:t>
+        <w:t xml:space="preserve">Fat embolism syndrome classically appears twenty-four to seventy-two hours after a long bone fracture with the triad of respiratory distress, neurologic changes, and petechiae on the chest, axillae, and conjunctivae; it is a life-threatening emergency requiring oxygen and immediate provider notification.</w:t>
       </w:r>
     </w:p>
     <w:p>

</xml_diff>

<commit_message>
Remove the ambiguous jaundice distractor from hpm-012; refresh study pack
Co-Authored-By: Claude Fable 5.1 <noreply@anthropic.com>
Claude-Session: https://claude.ai/code/session_01QeqMPafx2Y49qSQseFxfzV
</commit_message>
<xml_diff>
--- a/nclex-voice-quiz/study-pack/From Claude - NCLEX study pack/NCLEX question bank - readable (from Claude).docx
+++ b/nclex-voice-quiz/study-pack/From Claude - NCLEX study pack/NCLEX question bank - readable (from Claude).docx
@@ -7122,7 +7122,7 @@
           <w:sz w:val="18"/>
           <w:szCs w:val="18"/>
         </w:rPr>
-        <w:t xml:space="preserve">hpm-012 · Difficulty: hard · Clinical judgment: Analyze Cues · newborn, breastfeeding, jaundice, home visit</w:t>
+        <w:t xml:space="preserve">hpm-012 · Difficulty: hard · Clinical judgment: Analyze Cues · newborn, breastfeeding, home visit</w:t>
       </w:r>
     </w:p>
     <w:p>
@@ -7134,7 +7134,7 @@
           <w:b/>
           <w:bCs/>
         </w:rPr>
-        <w:t xml:space="preserve">During a home visit on the third day of life, a nurse assesses an exclusively breastfed term newborn. The parent reports that the baby feeds every four to five hours, is hard to wake for feedings, and had two wet diapers in the past 24 hours. The newborn has lost six percent of birth weight and has a yellow tint limited to the face. Which finding is most concerning?</w:t>
+        <w:t xml:space="preserve">During a home visit on the third day of life, a nurse assesses an exclusively breastfed term newborn. The parent reports that the baby feeds every four to five hours, is hard to wake for feedings, and had two wet diapers in the past 24 hours. The newborn has lost six percent of birth weight and has dry, peeling skin on the hands and feet. Which finding is most concerning?</w:t>
       </w:r>
     </w:p>
     <w:p>
@@ -7191,7 +7191,7 @@
         <w:t xml:space="preserve">C.  </w:t>
       </w:r>
       <w:r>
-        <w:t xml:space="preserve">Yellow tint limited to the face on day three.</w:t>
+        <w:t xml:space="preserve">Dry, peeling skin on the hands and feet.</w:t>
       </w:r>
     </w:p>
     <w:p>
@@ -7244,7 +7244,7 @@
         <w:t xml:space="preserve">B — correct: </w:t>
       </w:r>
       <w:r>
-        <w:t xml:space="preserve">By day three a newborn should have at least three wet diapers a day, rising to six or more by day five, and should feed eight to twelve times in 24 hours. Two wet diapers with infrequent, sleepy feeding signals inadequate intake and dehydration, which also drives bilirubin higher.</w:t>
+        <w:t xml:space="preserve">By day three a newborn should have at least three wet diapers a day, rising to six or more by day five, and should feed eight to twelve times in 24 hours. Two wet diapers with infrequent, sleepy feeding signals inadequate intake and dehydration, which raises the risk of hyperbilirubinemia and hypoglycemia and needs same-day follow-up.</w:t>
       </w:r>
     </w:p>
     <w:p>
@@ -7264,7 +7264,7 @@
         <w:t xml:space="preserve">C — incorrect: </w:t>
       </w:r>
       <w:r>
-        <w:t xml:space="preserve">Jaundice that appears after the first 24 hours and is confined to the face follows the usual physiologic pattern and bilirubin should be measured, but it is the poor intake that is causing the risk. Jaundice within the first 24 hours or spreading to the abdomen and legs would be the alarming pattern.</w:t>
+        <w:t xml:space="preserve">Superficial peeling of the hands and feet is common in term and post-term newborns during the first week; it needs only routine skin care and does not indicate dehydration, infection or illness.</w:t>
       </w:r>
     </w:p>
     <w:p>

</xml_diff>